<commit_message>
modification du document de spécification, ajoute des noms de l'équipe
</commit_message>
<xml_diff>
--- a/docs/Document_Specifications_SIH_v1.docx
+++ b/docs/Document_Specifications_SIH_v1.docx
@@ -148,7 +148,8 @@
       <w:pPr>
         <w:pStyle w:val="Normal"/>
         <w:spacing w:before="0" w:after="80"/>
-        <w:jc w:val="center"/>
+        <w:ind w:hanging="0" w:left="2160"/>
+        <w:jc w:val="left"/>
         <w:rPr/>
       </w:pPr>
       <w:r>
@@ -156,14 +157,319 @@
           <w:sz w:val="20"/>
           <w:szCs w:val="20"/>
         </w:rPr>
-        <w:t>Chef de Projet :</w:t>
-      </w:r>
+        <w:t>Chef de Projet :RAKOTONJANAHARY Miohitra</w:t>
+      </w:r>
+    </w:p>
+    <w:p>
+      <w:pPr>
+        <w:pStyle w:val="Normal"/>
+        <w:spacing w:before="0" w:after="80"/>
+        <w:ind w:hanging="0" w:left="2160"/>
+        <w:jc w:val="left"/>
+        <w:rPr/>
+      </w:pPr>
       <w:r>
         <w:rPr>
           <w:sz w:val="20"/>
           <w:szCs w:val="20"/>
         </w:rPr>
-        <w:t>RAKOTONJANAHARY Miohitra</w:t>
+        <w:t xml:space="preserve">Lead Backend/Architecte : Tsiry Nomena </w:t>
+      </w:r>
+    </w:p>
+    <w:p>
+      <w:pPr>
+        <w:pStyle w:val="Normal"/>
+        <w:spacing w:before="0" w:after="80"/>
+        <w:ind w:hanging="0" w:left="2160"/>
+        <w:jc w:val="left"/>
+        <w:rPr/>
+      </w:pPr>
+      <w:r>
+        <w:rPr>
+          <w:sz w:val="20"/>
+          <w:szCs w:val="20"/>
+        </w:rPr>
+        <w:t xml:space="preserve">Développeur Backend : Séverin Sahaefer </w:t>
+      </w:r>
+    </w:p>
+    <w:p>
+      <w:pPr>
+        <w:pStyle w:val="Normal"/>
+        <w:spacing w:before="0" w:after="80"/>
+        <w:ind w:hanging="0" w:left="2160"/>
+        <w:jc w:val="left"/>
+        <w:rPr/>
+      </w:pPr>
+      <w:r>
+        <w:rPr>
+          <w:sz w:val="20"/>
+          <w:szCs w:val="20"/>
+        </w:rPr>
+        <w:t xml:space="preserve">Développeur Frontend : Tsanta Niaina </w:t>
+      </w:r>
+    </w:p>
+    <w:p>
+      <w:pPr>
+        <w:pStyle w:val="Normal"/>
+        <w:spacing w:before="0" w:after="80"/>
+        <w:ind w:hanging="0" w:left="2160"/>
+        <w:jc w:val="left"/>
+        <w:rPr/>
+      </w:pPr>
+      <w:r>
+        <w:rPr>
+          <w:sz w:val="20"/>
+          <w:szCs w:val="20"/>
+        </w:rPr>
+        <w:t xml:space="preserve">DevOps/ Assurence Qulaité/Documentation : Antsa </w:t>
+      </w:r>
+    </w:p>
+    <w:p>
+      <w:pPr>
+        <w:pStyle w:val="Normal"/>
+        <w:jc w:val="center"/>
+        <w:rPr>
+          <w:sz w:val="20"/>
+          <w:szCs w:val="20"/>
+        </w:rPr>
+      </w:pPr>
+      <w:r>
+        <w:rPr/>
+      </w:r>
+    </w:p>
+    <w:p>
+      <w:pPr>
+        <w:pStyle w:val="Normal"/>
+        <w:jc w:val="center"/>
+        <w:rPr>
+          <w:sz w:val="20"/>
+          <w:szCs w:val="20"/>
+        </w:rPr>
+      </w:pPr>
+      <w:r>
+        <w:rPr/>
+      </w:r>
+    </w:p>
+    <w:p>
+      <w:pPr>
+        <w:pStyle w:val="Normal"/>
+        <w:jc w:val="center"/>
+        <w:rPr>
+          <w:sz w:val="20"/>
+          <w:szCs w:val="20"/>
+        </w:rPr>
+      </w:pPr>
+      <w:r>
+        <w:rPr/>
+      </w:r>
+    </w:p>
+    <w:p>
+      <w:pPr>
+        <w:pStyle w:val="Normal"/>
+        <w:jc w:val="center"/>
+        <w:rPr>
+          <w:sz w:val="20"/>
+          <w:szCs w:val="20"/>
+        </w:rPr>
+      </w:pPr>
+      <w:r>
+        <w:rPr/>
+      </w:r>
+    </w:p>
+    <w:p>
+      <w:pPr>
+        <w:pStyle w:val="Normal"/>
+        <w:jc w:val="center"/>
+        <w:rPr>
+          <w:sz w:val="20"/>
+          <w:szCs w:val="20"/>
+        </w:rPr>
+      </w:pPr>
+      <w:r>
+        <w:rPr/>
+      </w:r>
+    </w:p>
+    <w:p>
+      <w:pPr>
+        <w:pStyle w:val="Normal"/>
+        <w:jc w:val="center"/>
+        <w:rPr>
+          <w:sz w:val="20"/>
+          <w:szCs w:val="20"/>
+        </w:rPr>
+      </w:pPr>
+      <w:r>
+        <w:rPr/>
+      </w:r>
+    </w:p>
+    <w:p>
+      <w:pPr>
+        <w:pStyle w:val="Normal"/>
+        <w:jc w:val="center"/>
+        <w:rPr>
+          <w:sz w:val="20"/>
+          <w:szCs w:val="20"/>
+        </w:rPr>
+      </w:pPr>
+      <w:r>
+        <w:rPr/>
+      </w:r>
+    </w:p>
+    <w:p>
+      <w:pPr>
+        <w:pStyle w:val="Normal"/>
+        <w:jc w:val="center"/>
+        <w:rPr>
+          <w:sz w:val="20"/>
+          <w:szCs w:val="20"/>
+        </w:rPr>
+      </w:pPr>
+      <w:r>
+        <w:rPr/>
+      </w:r>
+    </w:p>
+    <w:p>
+      <w:pPr>
+        <w:pStyle w:val="Normal"/>
+        <w:jc w:val="center"/>
+        <w:rPr>
+          <w:sz w:val="20"/>
+          <w:szCs w:val="20"/>
+        </w:rPr>
+      </w:pPr>
+      <w:r>
+        <w:rPr/>
+      </w:r>
+    </w:p>
+    <w:p>
+      <w:pPr>
+        <w:pStyle w:val="Normal"/>
+        <w:jc w:val="center"/>
+        <w:rPr>
+          <w:sz w:val="20"/>
+          <w:szCs w:val="20"/>
+        </w:rPr>
+      </w:pPr>
+      <w:r>
+        <w:rPr/>
+      </w:r>
+    </w:p>
+    <w:p>
+      <w:pPr>
+        <w:pStyle w:val="Normal"/>
+        <w:jc w:val="center"/>
+        <w:rPr>
+          <w:sz w:val="20"/>
+          <w:szCs w:val="20"/>
+        </w:rPr>
+      </w:pPr>
+      <w:r>
+        <w:rPr/>
+      </w:r>
+    </w:p>
+    <w:p>
+      <w:pPr>
+        <w:pStyle w:val="Normal"/>
+        <w:jc w:val="center"/>
+        <w:rPr>
+          <w:sz w:val="20"/>
+          <w:szCs w:val="20"/>
+        </w:rPr>
+      </w:pPr>
+      <w:r>
+        <w:rPr/>
+      </w:r>
+    </w:p>
+    <w:p>
+      <w:pPr>
+        <w:pStyle w:val="Normal"/>
+        <w:jc w:val="center"/>
+        <w:rPr>
+          <w:sz w:val="20"/>
+          <w:szCs w:val="20"/>
+        </w:rPr>
+      </w:pPr>
+      <w:r>
+        <w:rPr/>
+      </w:r>
+    </w:p>
+    <w:p>
+      <w:pPr>
+        <w:pStyle w:val="Normal"/>
+        <w:jc w:val="center"/>
+        <w:rPr>
+          <w:sz w:val="20"/>
+          <w:szCs w:val="20"/>
+        </w:rPr>
+      </w:pPr>
+      <w:r>
+        <w:rPr/>
+      </w:r>
+    </w:p>
+    <w:p>
+      <w:pPr>
+        <w:pStyle w:val="Normal"/>
+        <w:jc w:val="center"/>
+        <w:rPr>
+          <w:sz w:val="20"/>
+          <w:szCs w:val="20"/>
+        </w:rPr>
+      </w:pPr>
+      <w:r>
+        <w:rPr/>
+      </w:r>
+    </w:p>
+    <w:p>
+      <w:pPr>
+        <w:pStyle w:val="Normal"/>
+        <w:jc w:val="center"/>
+        <w:rPr>
+          <w:sz w:val="20"/>
+          <w:szCs w:val="20"/>
+        </w:rPr>
+      </w:pPr>
+      <w:r>
+        <w:rPr/>
+      </w:r>
+    </w:p>
+    <w:p>
+      <w:pPr>
+        <w:pStyle w:val="Normal"/>
+        <w:jc w:val="center"/>
+        <w:rPr>
+          <w:sz w:val="20"/>
+          <w:szCs w:val="20"/>
+        </w:rPr>
+      </w:pPr>
+      <w:r>
+        <w:rPr/>
+      </w:r>
+    </w:p>
+    <w:p>
+      <w:pPr>
+        <w:pStyle w:val="Normal"/>
+        <w:jc w:val="center"/>
+        <w:rPr>
+          <w:sz w:val="20"/>
+          <w:szCs w:val="20"/>
+        </w:rPr>
+      </w:pPr>
+      <w:r>
+        <w:rPr/>
+      </w:r>
+    </w:p>
+    <w:p>
+      <w:pPr>
+        <w:pStyle w:val="Normal"/>
+        <w:jc w:val="center"/>
+        <w:rPr/>
+      </w:pPr>
+      <w:r>
+        <w:rPr>
+          <w:sz w:val="20"/>
+          <w:szCs w:val="20"/>
+        </w:rPr>
+        <w:t xml:space="preserve">Date de rédaction : 2 Août       </w:t>
       </w:r>
     </w:p>
     <w:p>
@@ -186,21 +492,7 @@
           <w:sz w:val="20"/>
           <w:szCs w:val="20"/>
         </w:rPr>
-        <w:t xml:space="preserve">Date de rédaction : </w:t>
-      </w:r>
-      <w:r>
-        <w:rPr>
-          <w:sz w:val="20"/>
-          <w:szCs w:val="20"/>
-        </w:rPr>
-        <w:t xml:space="preserve">2 Août </w:t>
-      </w:r>
-      <w:r>
-        <w:rPr>
-          <w:sz w:val="20"/>
-          <w:szCs w:val="20"/>
-        </w:rPr>
-        <w:t xml:space="preserve">      Date de rendu : 10 août 2026</w:t>
+        <w:t>Date de rendu : 10 août 2026</w:t>
       </w:r>
     </w:p>
     <w:p>
@@ -225,17 +517,43 @@
         <w:p>
           <w:pPr>
             <w:pStyle w:val="Normal"/>
-            <w:rPr/>
+            <w:widowControl/>
+            <w:suppressAutoHyphens w:val="true"/>
+            <w:bidi w:val="0"/>
+            <w:spacing w:before="0" w:after="0"/>
+            <w:jc w:val="left"/>
+            <w:rPr>
+              <w:rFonts w:ascii="Times New Roman" w:hAnsi="Times New Roman" w:eastAsia="Noto Serif CJK SC" w:cs="Noto Sans Devanagari"/>
+              <w:color w:val="auto"/>
+              <w:kern w:val="0"/>
+              <w:sz w:val="20"/>
+              <w:szCs w:val="20"/>
+              <w:lang w:val="fr-FR" w:eastAsia="zh-CN" w:bidi="hi-IN"/>
+            </w:rPr>
           </w:pPr>
           <w:r>
             <w:fldChar w:fldCharType="begin"/>
           </w:r>
           <w:r>
-            <w:rPr/>
+            <w:rPr>
+              <w:sz w:val="20"/>
+              <w:kern w:val="0"/>
+              <w:szCs w:val="20"/>
+              <w:rFonts w:eastAsia="Noto Serif CJK SC" w:cs="Noto Sans Devanagari"/>
+              <w:color w:val="auto"/>
+              <w:lang w:val="fr-FR" w:eastAsia="zh-CN" w:bidi="hi-IN"/>
+            </w:rPr>
             <w:instrText xml:space="preserve"> TOC \o "1-3" \h</w:instrText>
           </w:r>
           <w:r>
-            <w:rPr/>
+            <w:rPr>
+              <w:sz w:val="20"/>
+              <w:kern w:val="0"/>
+              <w:szCs w:val="20"/>
+              <w:rFonts w:eastAsia="Noto Serif CJK SC" w:cs="Noto Sans Devanagari"/>
+              <w:color w:val="auto"/>
+              <w:lang w:val="fr-FR" w:eastAsia="zh-CN" w:bidi="hi-IN"/>
+            </w:rPr>
             <w:fldChar w:fldCharType="separate"/>
           </w:r>
           <w:sdt>
@@ -245,15 +563,36 @@
             </w:sdtPr>
             <w:sdtContent>
               <w:r>
-                <w:rPr/>
+                <w:rPr>
+                  <w:rFonts w:eastAsia="Noto Serif CJK SC" w:cs="Noto Sans Devanagari"/>
+                  <w:color w:val="auto"/>
+                  <w:kern w:val="0"/>
+                  <w:sz w:val="20"/>
+                  <w:szCs w:val="20"/>
+                  <w:lang w:val="fr-FR" w:eastAsia="zh-CN" w:bidi="hi-IN"/>
+                </w:rPr>
               </w:r>
               <w:r>
-                <w:rPr/>
+                <w:rPr>
+                  <w:rFonts w:eastAsia="Noto Serif CJK SC" w:cs="Noto Sans Devanagari"/>
+                  <w:color w:val="auto"/>
+                  <w:kern w:val="0"/>
+                  <w:sz w:val="20"/>
+                  <w:szCs w:val="20"/>
+                  <w:lang w:val="fr-FR" w:eastAsia="zh-CN" w:bidi="hi-IN"/>
+                </w:rPr>
               </w:r>
             </w:sdtContent>
           </w:sdt>
           <w:r>
-            <w:rPr/>
+            <w:rPr>
+              <w:sz w:val="20"/>
+              <w:kern w:val="0"/>
+              <w:szCs w:val="20"/>
+              <w:rFonts w:eastAsia="Noto Serif CJK SC" w:cs="Noto Sans Devanagari"/>
+              <w:color w:val="auto"/>
+              <w:lang w:val="fr-FR" w:eastAsia="zh-CN" w:bidi="hi-IN"/>
+            </w:rPr>
             <w:fldChar w:fldCharType="end"/>
           </w:r>
         </w:p>
@@ -276,6 +615,15 @@
       <w:r>
         <w:rPr/>
       </w:r>
+    </w:p>
+    <w:p>
+      <w:pPr>
+        <w:pStyle w:val="Normal"/>
+        <w:rPr/>
+      </w:pPr>
+      <w:r>
+        <w:rPr/>
+      </w:r>
       <w:r>
         <w:br w:type="page"/>
       </w:r>
@@ -321,15 +669,7 @@
       </w:pPr>
       <w:r>
         <w:rPr/>
-        <w:t xml:space="preserve">Contrairement au CCFT, qui décrit un Système d'Information Hospitalier (SIH) complet de niveau industriel, ce document définit un périmètre volontairement réduit (MVP  Minimum Viable Product), adapté aux contraintes réelles du projet : une équipe de 5 étudiants, un délai </w:t>
-      </w:r>
-      <w:r>
-        <w:rPr/>
-        <w:t xml:space="preserve">réduit </w:t>
-      </w:r>
-      <w:r>
-        <w:rPr/>
-        <w:t>, et un objectif pédagogique de démonstration de compétences en ingénierie logicielle plutôt que de conformité réglementaire hospitalière réelle.</w:t>
+        <w:t>Contrairement au CCFT, qui décrit un Système d'Information Hospitalier (SIH) complet de niveau industriel, ce document définit un périmètre volontairement réduit (MVP  Minimum Viable Product), adapté aux contraintes réelles du projet : une équipe de 5 étudiants, un délai réduit , et un objectif pédagogique de démonstration de compétences en ingénierie logicielle plutôt que de conformité réglementaire hospitalière réelle.</w:t>
       </w:r>
     </w:p>
     <w:p>
@@ -359,7 +699,7 @@
         <w:pStyle w:val="ListParagraph"/>
         <w:numPr>
           <w:ilvl w:val="0"/>
-          <w:numId w:val="3"/>
+          <w:numId w:val="4"/>
         </w:numPr>
         <w:spacing w:before="0" w:after="80"/>
         <w:rPr/>
@@ -374,7 +714,7 @@
         <w:pStyle w:val="ListParagraph"/>
         <w:numPr>
           <w:ilvl w:val="0"/>
-          <w:numId w:val="1"/>
+          <w:numId w:val="5"/>
         </w:numPr>
         <w:spacing w:before="0" w:after="80"/>
         <w:rPr/>
@@ -389,7 +729,7 @@
         <w:pStyle w:val="ListParagraph"/>
         <w:numPr>
           <w:ilvl w:val="0"/>
-          <w:numId w:val="1"/>
+          <w:numId w:val="6"/>
         </w:numPr>
         <w:spacing w:before="0" w:after="80"/>
         <w:rPr/>
@@ -415,7 +755,7 @@
         <w:pStyle w:val="ListParagraph"/>
         <w:numPr>
           <w:ilvl w:val="0"/>
-          <w:numId w:val="1"/>
+          <w:numId w:val="7"/>
         </w:numPr>
         <w:spacing w:before="0" w:after="80"/>
         <w:rPr/>
@@ -430,7 +770,7 @@
         <w:pStyle w:val="ListParagraph"/>
         <w:numPr>
           <w:ilvl w:val="0"/>
-          <w:numId w:val="1"/>
+          <w:numId w:val="8"/>
         </w:numPr>
         <w:spacing w:before="0" w:after="80"/>
         <w:rPr/>
@@ -476,8 +816,8 @@
         </w:tblCellMar>
       </w:tblPr>
       <w:tblGrid>
-        <w:gridCol w:w="899"/>
-        <w:gridCol w:w="3201"/>
+        <w:gridCol w:w="898"/>
+        <w:gridCol w:w="3202"/>
         <w:gridCol w:w="5300"/>
       </w:tblGrid>
       <w:tr>
@@ -486,7 +826,7 @@
         </w:trPr>
         <w:tc>
           <w:tcPr>
-            <w:tcW w:w="899" w:type="dxa"/>
+            <w:tcW w:w="898" w:type="dxa"/>
             <w:tcBorders>
               <w:top w:val="single" w:sz="4" w:space="0" w:color="000000"/>
               <w:left w:val="single" w:sz="4" w:space="0" w:color="000000"/>
@@ -513,7 +853,7 @@
         </w:tc>
         <w:tc>
           <w:tcPr>
-            <w:tcW w:w="3201" w:type="dxa"/>
+            <w:tcW w:w="3202" w:type="dxa"/>
             <w:tcBorders>
               <w:top w:val="single" w:sz="4" w:space="0" w:color="000000"/>
               <w:left w:val="single" w:sz="4" w:space="0" w:color="000000"/>
@@ -570,7 +910,7 @@
         <w:trPr/>
         <w:tc>
           <w:tcPr>
-            <w:tcW w:w="899" w:type="dxa"/>
+            <w:tcW w:w="898" w:type="dxa"/>
             <w:tcBorders>
               <w:top w:val="single" w:sz="4" w:space="0" w:color="000000"/>
               <w:left w:val="single" w:sz="4" w:space="0" w:color="000000"/>
@@ -596,7 +936,7 @@
         </w:tc>
         <w:tc>
           <w:tcPr>
-            <w:tcW w:w="3201" w:type="dxa"/>
+            <w:tcW w:w="3202" w:type="dxa"/>
             <w:tcBorders>
               <w:top w:val="single" w:sz="4" w:space="0" w:color="000000"/>
               <w:left w:val="single" w:sz="4" w:space="0" w:color="000000"/>
@@ -651,7 +991,7 @@
         <w:trPr/>
         <w:tc>
           <w:tcPr>
-            <w:tcW w:w="899" w:type="dxa"/>
+            <w:tcW w:w="898" w:type="dxa"/>
             <w:tcBorders>
               <w:top w:val="single" w:sz="4" w:space="0" w:color="000000"/>
               <w:left w:val="single" w:sz="4" w:space="0" w:color="000000"/>
@@ -678,7 +1018,7 @@
         </w:tc>
         <w:tc>
           <w:tcPr>
-            <w:tcW w:w="3201" w:type="dxa"/>
+            <w:tcW w:w="3202" w:type="dxa"/>
             <w:tcBorders>
               <w:top w:val="single" w:sz="4" w:space="0" w:color="000000"/>
               <w:left w:val="single" w:sz="4" w:space="0" w:color="000000"/>
@@ -735,7 +1075,7 @@
         <w:trPr/>
         <w:tc>
           <w:tcPr>
-            <w:tcW w:w="899" w:type="dxa"/>
+            <w:tcW w:w="898" w:type="dxa"/>
             <w:tcBorders>
               <w:top w:val="single" w:sz="4" w:space="0" w:color="000000"/>
               <w:left w:val="single" w:sz="4" w:space="0" w:color="000000"/>
@@ -761,7 +1101,7 @@
         </w:tc>
         <w:tc>
           <w:tcPr>
-            <w:tcW w:w="3201" w:type="dxa"/>
+            <w:tcW w:w="3202" w:type="dxa"/>
             <w:tcBorders>
               <w:top w:val="single" w:sz="4" w:space="0" w:color="000000"/>
               <w:left w:val="single" w:sz="4" w:space="0" w:color="000000"/>
@@ -816,7 +1156,7 @@
         <w:trPr/>
         <w:tc>
           <w:tcPr>
-            <w:tcW w:w="899" w:type="dxa"/>
+            <w:tcW w:w="898" w:type="dxa"/>
             <w:tcBorders>
               <w:top w:val="single" w:sz="4" w:space="0" w:color="000000"/>
               <w:left w:val="single" w:sz="4" w:space="0" w:color="000000"/>
@@ -843,7 +1183,7 @@
         </w:tc>
         <w:tc>
           <w:tcPr>
-            <w:tcW w:w="3201" w:type="dxa"/>
+            <w:tcW w:w="3202" w:type="dxa"/>
             <w:tcBorders>
               <w:top w:val="single" w:sz="4" w:space="0" w:color="000000"/>
               <w:left w:val="single" w:sz="4" w:space="0" w:color="000000"/>
@@ -1390,7 +1730,7 @@
         <w:pStyle w:val="ListParagraph"/>
         <w:numPr>
           <w:ilvl w:val="0"/>
-          <w:numId w:val="1"/>
+          <w:numId w:val="9"/>
         </w:numPr>
         <w:spacing w:before="0" w:after="80"/>
         <w:rPr/>
@@ -1405,7 +1745,7 @@
         <w:pStyle w:val="ListParagraph"/>
         <w:numPr>
           <w:ilvl w:val="0"/>
-          <w:numId w:val="1"/>
+          <w:numId w:val="10"/>
         </w:numPr>
         <w:spacing w:before="0" w:after="80"/>
         <w:rPr/>
@@ -1420,7 +1760,7 @@
         <w:pStyle w:val="ListParagraph"/>
         <w:numPr>
           <w:ilvl w:val="0"/>
-          <w:numId w:val="1"/>
+          <w:numId w:val="11"/>
         </w:numPr>
         <w:spacing w:before="0" w:after="80"/>
         <w:rPr/>
@@ -1446,7 +1786,7 @@
         <w:pStyle w:val="ListParagraph"/>
         <w:numPr>
           <w:ilvl w:val="0"/>
-          <w:numId w:val="1"/>
+          <w:numId w:val="12"/>
         </w:numPr>
         <w:spacing w:before="0" w:after="80"/>
         <w:rPr/>
@@ -1461,7 +1801,7 @@
         <w:pStyle w:val="ListParagraph"/>
         <w:numPr>
           <w:ilvl w:val="0"/>
-          <w:numId w:val="1"/>
+          <w:numId w:val="13"/>
         </w:numPr>
         <w:spacing w:before="0" w:after="80"/>
         <w:rPr/>
@@ -1476,7 +1816,7 @@
         <w:pStyle w:val="ListParagraph"/>
         <w:numPr>
           <w:ilvl w:val="0"/>
-          <w:numId w:val="1"/>
+          <w:numId w:val="14"/>
         </w:numPr>
         <w:spacing w:before="0" w:after="80"/>
         <w:rPr/>
@@ -1491,7 +1831,7 @@
         <w:pStyle w:val="ListParagraph"/>
         <w:numPr>
           <w:ilvl w:val="0"/>
-          <w:numId w:val="1"/>
+          <w:numId w:val="15"/>
         </w:numPr>
         <w:spacing w:before="0" w:after="80"/>
         <w:rPr/>
@@ -1528,7 +1868,7 @@
         <w:pStyle w:val="ListParagraph"/>
         <w:numPr>
           <w:ilvl w:val="0"/>
-          <w:numId w:val="1"/>
+          <w:numId w:val="16"/>
         </w:numPr>
         <w:spacing w:before="0" w:after="80"/>
         <w:rPr/>
@@ -1543,7 +1883,7 @@
         <w:pStyle w:val="ListParagraph"/>
         <w:numPr>
           <w:ilvl w:val="0"/>
-          <w:numId w:val="1"/>
+          <w:numId w:val="17"/>
         </w:numPr>
         <w:spacing w:before="0" w:after="80"/>
         <w:rPr/>
@@ -1558,7 +1898,7 @@
         <w:pStyle w:val="ListParagraph"/>
         <w:numPr>
           <w:ilvl w:val="0"/>
-          <w:numId w:val="1"/>
+          <w:numId w:val="18"/>
         </w:numPr>
         <w:spacing w:before="0" w:after="80"/>
         <w:rPr/>
@@ -1584,7 +1924,7 @@
         <w:pStyle w:val="ListParagraph"/>
         <w:numPr>
           <w:ilvl w:val="0"/>
-          <w:numId w:val="1"/>
+          <w:numId w:val="19"/>
         </w:numPr>
         <w:spacing w:before="0" w:after="80"/>
         <w:rPr/>
@@ -1599,7 +1939,7 @@
         <w:pStyle w:val="ListParagraph"/>
         <w:numPr>
           <w:ilvl w:val="0"/>
-          <w:numId w:val="1"/>
+          <w:numId w:val="20"/>
         </w:numPr>
         <w:spacing w:before="0" w:after="80"/>
         <w:rPr/>
@@ -1614,7 +1954,7 @@
         <w:pStyle w:val="ListParagraph"/>
         <w:numPr>
           <w:ilvl w:val="0"/>
-          <w:numId w:val="1"/>
+          <w:numId w:val="21"/>
         </w:numPr>
         <w:spacing w:before="0" w:after="80"/>
         <w:rPr/>
@@ -1651,7 +1991,7 @@
         <w:pStyle w:val="ListParagraph"/>
         <w:numPr>
           <w:ilvl w:val="0"/>
-          <w:numId w:val="1"/>
+          <w:numId w:val="22"/>
         </w:numPr>
         <w:spacing w:before="0" w:after="80"/>
         <w:rPr/>
@@ -1666,7 +2006,7 @@
         <w:pStyle w:val="ListParagraph"/>
         <w:numPr>
           <w:ilvl w:val="0"/>
-          <w:numId w:val="1"/>
+          <w:numId w:val="23"/>
         </w:numPr>
         <w:spacing w:before="0" w:after="80"/>
         <w:rPr/>
@@ -1681,7 +2021,7 @@
         <w:pStyle w:val="ListParagraph"/>
         <w:numPr>
           <w:ilvl w:val="0"/>
-          <w:numId w:val="1"/>
+          <w:numId w:val="24"/>
         </w:numPr>
         <w:spacing w:before="0" w:after="80"/>
         <w:rPr/>
@@ -1707,7 +2047,7 @@
         <w:pStyle w:val="ListParagraph"/>
         <w:numPr>
           <w:ilvl w:val="0"/>
-          <w:numId w:val="1"/>
+          <w:numId w:val="25"/>
         </w:numPr>
         <w:spacing w:before="0" w:after="80"/>
         <w:rPr/>
@@ -1722,7 +2062,7 @@
         <w:pStyle w:val="ListParagraph"/>
         <w:numPr>
           <w:ilvl w:val="0"/>
-          <w:numId w:val="1"/>
+          <w:numId w:val="26"/>
         </w:numPr>
         <w:spacing w:before="0" w:after="80"/>
         <w:rPr/>
@@ -1737,7 +2077,7 @@
         <w:pStyle w:val="ListParagraph"/>
         <w:numPr>
           <w:ilvl w:val="0"/>
-          <w:numId w:val="1"/>
+          <w:numId w:val="27"/>
         </w:numPr>
         <w:spacing w:before="0" w:after="80"/>
         <w:rPr/>
@@ -1774,7 +2114,7 @@
         <w:pStyle w:val="ListParagraph"/>
         <w:numPr>
           <w:ilvl w:val="0"/>
-          <w:numId w:val="1"/>
+          <w:numId w:val="28"/>
         </w:numPr>
         <w:spacing w:before="0" w:after="80"/>
         <w:rPr/>
@@ -1789,7 +2129,7 @@
         <w:pStyle w:val="ListParagraph"/>
         <w:numPr>
           <w:ilvl w:val="0"/>
-          <w:numId w:val="1"/>
+          <w:numId w:val="29"/>
         </w:numPr>
         <w:spacing w:before="0" w:after="80"/>
         <w:rPr/>
@@ -1815,7 +2155,7 @@
         <w:pStyle w:val="ListParagraph"/>
         <w:numPr>
           <w:ilvl w:val="0"/>
-          <w:numId w:val="1"/>
+          <w:numId w:val="30"/>
         </w:numPr>
         <w:spacing w:before="0" w:after="80"/>
         <w:rPr/>
@@ -1830,7 +2170,7 @@
         <w:pStyle w:val="ListParagraph"/>
         <w:numPr>
           <w:ilvl w:val="0"/>
-          <w:numId w:val="1"/>
+          <w:numId w:val="31"/>
         </w:numPr>
         <w:spacing w:before="0" w:after="80"/>
         <w:rPr/>
@@ -1845,7 +2185,7 @@
         <w:pStyle w:val="ListParagraph"/>
         <w:numPr>
           <w:ilvl w:val="0"/>
-          <w:numId w:val="1"/>
+          <w:numId w:val="32"/>
         </w:numPr>
         <w:spacing w:before="0" w:after="80"/>
         <w:rPr/>
@@ -1892,8 +2232,8 @@
       </w:tblPr>
       <w:tblGrid>
         <w:gridCol w:w="1800"/>
-        <w:gridCol w:w="3799"/>
-        <w:gridCol w:w="3801"/>
+        <w:gridCol w:w="3798"/>
+        <w:gridCol w:w="3802"/>
       </w:tblGrid>
       <w:tr>
         <w:trPr>
@@ -1928,7 +2268,7 @@
         </w:tc>
         <w:tc>
           <w:tcPr>
-            <w:tcW w:w="3799" w:type="dxa"/>
+            <w:tcW w:w="3798" w:type="dxa"/>
             <w:tcBorders>
               <w:top w:val="single" w:sz="4" w:space="0" w:color="000000"/>
               <w:left w:val="single" w:sz="4" w:space="0" w:color="000000"/>
@@ -1955,7 +2295,7 @@
         </w:tc>
         <w:tc>
           <w:tcPr>
-            <w:tcW w:w="3801" w:type="dxa"/>
+            <w:tcW w:w="3802" w:type="dxa"/>
             <w:tcBorders>
               <w:top w:val="single" w:sz="4" w:space="0" w:color="000000"/>
               <w:left w:val="single" w:sz="4" w:space="0" w:color="000000"/>
@@ -2011,7 +2351,7 @@
         </w:tc>
         <w:tc>
           <w:tcPr>
-            <w:tcW w:w="3799" w:type="dxa"/>
+            <w:tcW w:w="3798" w:type="dxa"/>
             <w:tcBorders>
               <w:top w:val="single" w:sz="4" w:space="0" w:color="000000"/>
               <w:left w:val="single" w:sz="4" w:space="0" w:color="000000"/>
@@ -2037,7 +2377,7 @@
         </w:tc>
         <w:tc>
           <w:tcPr>
-            <w:tcW w:w="3801" w:type="dxa"/>
+            <w:tcW w:w="3802" w:type="dxa"/>
             <w:tcBorders>
               <w:top w:val="single" w:sz="4" w:space="0" w:color="000000"/>
               <w:left w:val="single" w:sz="4" w:space="0" w:color="000000"/>
@@ -2093,7 +2433,7 @@
         </w:tc>
         <w:tc>
           <w:tcPr>
-            <w:tcW w:w="3799" w:type="dxa"/>
+            <w:tcW w:w="3798" w:type="dxa"/>
             <w:tcBorders>
               <w:top w:val="single" w:sz="4" w:space="0" w:color="000000"/>
               <w:left w:val="single" w:sz="4" w:space="0" w:color="000000"/>
@@ -2120,7 +2460,7 @@
         </w:tc>
         <w:tc>
           <w:tcPr>
-            <w:tcW w:w="3801" w:type="dxa"/>
+            <w:tcW w:w="3802" w:type="dxa"/>
             <w:tcBorders>
               <w:top w:val="single" w:sz="4" w:space="0" w:color="000000"/>
               <w:left w:val="single" w:sz="4" w:space="0" w:color="000000"/>
@@ -2176,7 +2516,7 @@
         </w:tc>
         <w:tc>
           <w:tcPr>
-            <w:tcW w:w="3799" w:type="dxa"/>
+            <w:tcW w:w="3798" w:type="dxa"/>
             <w:tcBorders>
               <w:top w:val="single" w:sz="4" w:space="0" w:color="000000"/>
               <w:left w:val="single" w:sz="4" w:space="0" w:color="000000"/>
@@ -2202,7 +2542,7 @@
         </w:tc>
         <w:tc>
           <w:tcPr>
-            <w:tcW w:w="3801" w:type="dxa"/>
+            <w:tcW w:w="3802" w:type="dxa"/>
             <w:tcBorders>
               <w:top w:val="single" w:sz="4" w:space="0" w:color="000000"/>
               <w:left w:val="single" w:sz="4" w:space="0" w:color="000000"/>
@@ -2258,7 +2598,7 @@
         </w:tc>
         <w:tc>
           <w:tcPr>
-            <w:tcW w:w="3799" w:type="dxa"/>
+            <w:tcW w:w="3798" w:type="dxa"/>
             <w:tcBorders>
               <w:top w:val="single" w:sz="4" w:space="0" w:color="000000"/>
               <w:left w:val="single" w:sz="4" w:space="0" w:color="000000"/>
@@ -2285,7 +2625,7 @@
         </w:tc>
         <w:tc>
           <w:tcPr>
-            <w:tcW w:w="3801" w:type="dxa"/>
+            <w:tcW w:w="3802" w:type="dxa"/>
             <w:tcBorders>
               <w:top w:val="single" w:sz="4" w:space="0" w:color="000000"/>
               <w:left w:val="single" w:sz="4" w:space="0" w:color="000000"/>
@@ -2341,7 +2681,7 @@
         </w:tc>
         <w:tc>
           <w:tcPr>
-            <w:tcW w:w="3799" w:type="dxa"/>
+            <w:tcW w:w="3798" w:type="dxa"/>
             <w:tcBorders>
               <w:top w:val="single" w:sz="4" w:space="0" w:color="000000"/>
               <w:left w:val="single" w:sz="4" w:space="0" w:color="000000"/>
@@ -2367,7 +2707,7 @@
         </w:tc>
         <w:tc>
           <w:tcPr>
-            <w:tcW w:w="3801" w:type="dxa"/>
+            <w:tcW w:w="3802" w:type="dxa"/>
             <w:tcBorders>
               <w:top w:val="single" w:sz="4" w:space="0" w:color="000000"/>
               <w:left w:val="single" w:sz="4" w:space="0" w:color="000000"/>
@@ -2423,17 +2763,7 @@
           <w:iCs w:val="false"/>
           <w:color w:val="595959"/>
         </w:rPr>
-        <w:t>C</w:t>
-      </w:r>
-      <w:r>
-        <w:rPr>
-          <w:b/>
-          <w:bCs/>
-          <w:i w:val="false"/>
-          <w:iCs w:val="false"/>
-          <w:color w:val="595959"/>
-        </w:rPr>
-        <w:t>ontrairement au CCFT d'origine qui prévoit une base de données distincte par microservice, ce projet utilise une base de données relationnelle unique (PostgreSQL), cohérente avec une architecture monolithique adaptée au périmètre réduit.</w:t>
+        <w:t>Contrairement au CCFT d'origine qui prévoit une base de données distincte par microservice, ce projet utilise une base de données relationnelle unique (PostgreSQL), cohérente avec une architecture monolithique adaptée au périmètre réduit.</w:t>
       </w:r>
     </w:p>
     <w:p>
@@ -2472,8 +2802,8 @@
         </w:tblCellMar>
       </w:tblPr>
       <w:tblGrid>
-        <w:gridCol w:w="1599"/>
-        <w:gridCol w:w="2001"/>
+        <w:gridCol w:w="1598"/>
+        <w:gridCol w:w="2002"/>
         <w:gridCol w:w="5800"/>
       </w:tblGrid>
       <w:tr>
@@ -2482,7 +2812,7 @@
         </w:trPr>
         <w:tc>
           <w:tcPr>
-            <w:tcW w:w="1599" w:type="dxa"/>
+            <w:tcW w:w="1598" w:type="dxa"/>
             <w:tcBorders>
               <w:top w:val="single" w:sz="4" w:space="0" w:color="000000"/>
               <w:left w:val="single" w:sz="4" w:space="0" w:color="000000"/>
@@ -2509,7 +2839,7 @@
         </w:tc>
         <w:tc>
           <w:tcPr>
-            <w:tcW w:w="2001" w:type="dxa"/>
+            <w:tcW w:w="2002" w:type="dxa"/>
             <w:tcBorders>
               <w:top w:val="single" w:sz="4" w:space="0" w:color="000000"/>
               <w:left w:val="single" w:sz="4" w:space="0" w:color="000000"/>
@@ -2566,7 +2896,7 @@
         <w:trPr/>
         <w:tc>
           <w:tcPr>
-            <w:tcW w:w="1599" w:type="dxa"/>
+            <w:tcW w:w="1598" w:type="dxa"/>
             <w:tcBorders>
               <w:top w:val="single" w:sz="4" w:space="0" w:color="000000"/>
               <w:left w:val="single" w:sz="4" w:space="0" w:color="000000"/>
@@ -2592,7 +2922,7 @@
         </w:tc>
         <w:tc>
           <w:tcPr>
-            <w:tcW w:w="2001" w:type="dxa"/>
+            <w:tcW w:w="2002" w:type="dxa"/>
             <w:tcBorders>
               <w:top w:val="single" w:sz="4" w:space="0" w:color="000000"/>
               <w:left w:val="single" w:sz="4" w:space="0" w:color="000000"/>
@@ -2647,7 +2977,7 @@
         <w:trPr/>
         <w:tc>
           <w:tcPr>
-            <w:tcW w:w="1599" w:type="dxa"/>
+            <w:tcW w:w="1598" w:type="dxa"/>
             <w:tcBorders>
               <w:top w:val="single" w:sz="4" w:space="0" w:color="000000"/>
               <w:left w:val="single" w:sz="4" w:space="0" w:color="000000"/>
@@ -2674,7 +3004,7 @@
         </w:tc>
         <w:tc>
           <w:tcPr>
-            <w:tcW w:w="2001" w:type="dxa"/>
+            <w:tcW w:w="2002" w:type="dxa"/>
             <w:tcBorders>
               <w:top w:val="single" w:sz="4" w:space="0" w:color="000000"/>
               <w:left w:val="single" w:sz="4" w:space="0" w:color="000000"/>
@@ -2731,7 +3061,7 @@
         <w:trPr/>
         <w:tc>
           <w:tcPr>
-            <w:tcW w:w="1599" w:type="dxa"/>
+            <w:tcW w:w="1598" w:type="dxa"/>
             <w:tcBorders>
               <w:top w:val="single" w:sz="4" w:space="0" w:color="000000"/>
               <w:left w:val="single" w:sz="4" w:space="0" w:color="000000"/>
@@ -2757,7 +3087,7 @@
         </w:tc>
         <w:tc>
           <w:tcPr>
-            <w:tcW w:w="2001" w:type="dxa"/>
+            <w:tcW w:w="2002" w:type="dxa"/>
             <w:tcBorders>
               <w:top w:val="single" w:sz="4" w:space="0" w:color="000000"/>
               <w:left w:val="single" w:sz="4" w:space="0" w:color="000000"/>
@@ -2812,7 +3142,7 @@
         <w:trPr/>
         <w:tc>
           <w:tcPr>
-            <w:tcW w:w="1599" w:type="dxa"/>
+            <w:tcW w:w="1598" w:type="dxa"/>
             <w:tcBorders>
               <w:top w:val="single" w:sz="4" w:space="0" w:color="000000"/>
               <w:left w:val="single" w:sz="4" w:space="0" w:color="000000"/>
@@ -2839,7 +3169,7 @@
         </w:tc>
         <w:tc>
           <w:tcPr>
-            <w:tcW w:w="2001" w:type="dxa"/>
+            <w:tcW w:w="2002" w:type="dxa"/>
             <w:tcBorders>
               <w:top w:val="single" w:sz="4" w:space="0" w:color="000000"/>
               <w:left w:val="single" w:sz="4" w:space="0" w:color="000000"/>
@@ -2896,7 +3226,7 @@
         <w:trPr/>
         <w:tc>
           <w:tcPr>
-            <w:tcW w:w="1599" w:type="dxa"/>
+            <w:tcW w:w="1598" w:type="dxa"/>
             <w:tcBorders>
               <w:top w:val="single" w:sz="4" w:space="0" w:color="000000"/>
               <w:left w:val="single" w:sz="4" w:space="0" w:color="000000"/>
@@ -2922,7 +3252,7 @@
         </w:tc>
         <w:tc>
           <w:tcPr>
-            <w:tcW w:w="2001" w:type="dxa"/>
+            <w:tcW w:w="2002" w:type="dxa"/>
             <w:tcBorders>
               <w:top w:val="single" w:sz="4" w:space="0" w:color="000000"/>
               <w:left w:val="single" w:sz="4" w:space="0" w:color="000000"/>
@@ -2977,7 +3307,7 @@
         <w:trPr/>
         <w:tc>
           <w:tcPr>
-            <w:tcW w:w="1599" w:type="dxa"/>
+            <w:tcW w:w="1598" w:type="dxa"/>
             <w:tcBorders>
               <w:top w:val="single" w:sz="4" w:space="0" w:color="000000"/>
               <w:left w:val="single" w:sz="4" w:space="0" w:color="000000"/>
@@ -3004,7 +3334,7 @@
         </w:tc>
         <w:tc>
           <w:tcPr>
-            <w:tcW w:w="2001" w:type="dxa"/>
+            <w:tcW w:w="2002" w:type="dxa"/>
             <w:tcBorders>
               <w:top w:val="single" w:sz="4" w:space="0" w:color="000000"/>
               <w:left w:val="single" w:sz="4" w:space="0" w:color="000000"/>
@@ -3061,7 +3391,7 @@
         <w:trPr/>
         <w:tc>
           <w:tcPr>
-            <w:tcW w:w="1599" w:type="dxa"/>
+            <w:tcW w:w="1598" w:type="dxa"/>
             <w:tcBorders>
               <w:top w:val="single" w:sz="4" w:space="0" w:color="000000"/>
               <w:left w:val="single" w:sz="4" w:space="0" w:color="000000"/>
@@ -3087,7 +3417,7 @@
         </w:tc>
         <w:tc>
           <w:tcPr>
-            <w:tcW w:w="2001" w:type="dxa"/>
+            <w:tcW w:w="2002" w:type="dxa"/>
             <w:tcBorders>
               <w:top w:val="single" w:sz="4" w:space="0" w:color="000000"/>
               <w:left w:val="single" w:sz="4" w:space="0" w:color="000000"/>
@@ -3757,7 +4087,7 @@
         <w:pStyle w:val="ListParagraph"/>
         <w:numPr>
           <w:ilvl w:val="0"/>
-          <w:numId w:val="1"/>
+          <w:numId w:val="33"/>
         </w:numPr>
         <w:spacing w:before="0" w:after="80"/>
         <w:rPr/>
@@ -3772,7 +4102,7 @@
         <w:pStyle w:val="ListParagraph"/>
         <w:numPr>
           <w:ilvl w:val="0"/>
-          <w:numId w:val="1"/>
+          <w:numId w:val="34"/>
         </w:numPr>
         <w:spacing w:before="0" w:after="80"/>
         <w:rPr/>
@@ -3787,7 +4117,7 @@
         <w:pStyle w:val="ListParagraph"/>
         <w:numPr>
           <w:ilvl w:val="0"/>
-          <w:numId w:val="1"/>
+          <w:numId w:val="35"/>
         </w:numPr>
         <w:spacing w:before="0" w:after="80"/>
         <w:rPr/>
@@ -3802,7 +4132,7 @@
         <w:pStyle w:val="ListParagraph"/>
         <w:numPr>
           <w:ilvl w:val="0"/>
-          <w:numId w:val="1"/>
+          <w:numId w:val="36"/>
         </w:numPr>
         <w:spacing w:before="0" w:after="80"/>
         <w:rPr/>
@@ -3817,7 +4147,7 @@
         <w:pStyle w:val="ListParagraph"/>
         <w:numPr>
           <w:ilvl w:val="0"/>
-          <w:numId w:val="1"/>
+          <w:numId w:val="37"/>
         </w:numPr>
         <w:spacing w:before="0" w:after="80"/>
         <w:rPr/>
@@ -3853,7 +4183,7 @@
     <w:p>
       <w:pPr>
         <w:pStyle w:val="Heading1"/>
-        <w:spacing w:before="400" w:after="200"/>
+        <w:spacing w:before="0" w:after="200"/>
         <w:rPr/>
       </w:pPr>
       <w:r>
@@ -3875,8 +4205,8 @@
         </w:tblCellMar>
       </w:tblPr>
       <w:tblGrid>
-        <w:gridCol w:w="1399"/>
-        <w:gridCol w:w="4301"/>
+        <w:gridCol w:w="1398"/>
+        <w:gridCol w:w="4302"/>
         <w:gridCol w:w="3900"/>
       </w:tblGrid>
       <w:tr>
@@ -3885,7 +4215,7 @@
         </w:trPr>
         <w:tc>
           <w:tcPr>
-            <w:tcW w:w="1399" w:type="dxa"/>
+            <w:tcW w:w="1398" w:type="dxa"/>
             <w:tcBorders>
               <w:top w:val="single" w:sz="4" w:space="0" w:color="000000"/>
               <w:left w:val="single" w:sz="4" w:space="0" w:color="000000"/>
@@ -3912,7 +4242,7 @@
         </w:tc>
         <w:tc>
           <w:tcPr>
-            <w:tcW w:w="4301" w:type="dxa"/>
+            <w:tcW w:w="4302" w:type="dxa"/>
             <w:tcBorders>
               <w:top w:val="single" w:sz="4" w:space="0" w:color="000000"/>
               <w:left w:val="single" w:sz="4" w:space="0" w:color="000000"/>
@@ -3969,7 +4299,7 @@
         <w:trPr/>
         <w:tc>
           <w:tcPr>
-            <w:tcW w:w="1399" w:type="dxa"/>
+            <w:tcW w:w="1398" w:type="dxa"/>
             <w:tcBorders>
               <w:top w:val="single" w:sz="4" w:space="0" w:color="000000"/>
               <w:left w:val="single" w:sz="4" w:space="0" w:color="000000"/>
@@ -3995,7 +4325,7 @@
         </w:tc>
         <w:tc>
           <w:tcPr>
-            <w:tcW w:w="4301" w:type="dxa"/>
+            <w:tcW w:w="4302" w:type="dxa"/>
             <w:tcBorders>
               <w:top w:val="single" w:sz="4" w:space="0" w:color="000000"/>
               <w:left w:val="single" w:sz="4" w:space="0" w:color="000000"/>
@@ -4050,7 +4380,7 @@
         <w:trPr/>
         <w:tc>
           <w:tcPr>
-            <w:tcW w:w="1399" w:type="dxa"/>
+            <w:tcW w:w="1398" w:type="dxa"/>
             <w:tcBorders>
               <w:top w:val="single" w:sz="4" w:space="0" w:color="000000"/>
               <w:left w:val="single" w:sz="4" w:space="0" w:color="000000"/>
@@ -4077,7 +4407,7 @@
         </w:tc>
         <w:tc>
           <w:tcPr>
-            <w:tcW w:w="4301" w:type="dxa"/>
+            <w:tcW w:w="4302" w:type="dxa"/>
             <w:tcBorders>
               <w:top w:val="single" w:sz="4" w:space="0" w:color="000000"/>
               <w:left w:val="single" w:sz="4" w:space="0" w:color="000000"/>
@@ -4134,7 +4464,7 @@
         <w:trPr/>
         <w:tc>
           <w:tcPr>
-            <w:tcW w:w="1399" w:type="dxa"/>
+            <w:tcW w:w="1398" w:type="dxa"/>
             <w:tcBorders>
               <w:top w:val="single" w:sz="4" w:space="0" w:color="000000"/>
               <w:left w:val="single" w:sz="4" w:space="0" w:color="000000"/>
@@ -4160,7 +4490,7 @@
         </w:tc>
         <w:tc>
           <w:tcPr>
-            <w:tcW w:w="4301" w:type="dxa"/>
+            <w:tcW w:w="4302" w:type="dxa"/>
             <w:tcBorders>
               <w:top w:val="single" w:sz="4" w:space="0" w:color="000000"/>
               <w:left w:val="single" w:sz="4" w:space="0" w:color="000000"/>
@@ -4215,7 +4545,7 @@
         <w:trPr/>
         <w:tc>
           <w:tcPr>
-            <w:tcW w:w="1399" w:type="dxa"/>
+            <w:tcW w:w="1398" w:type="dxa"/>
             <w:tcBorders>
               <w:top w:val="single" w:sz="4" w:space="0" w:color="000000"/>
               <w:left w:val="single" w:sz="4" w:space="0" w:color="000000"/>
@@ -4242,7 +4572,7 @@
         </w:tc>
         <w:tc>
           <w:tcPr>
-            <w:tcW w:w="4301" w:type="dxa"/>
+            <w:tcW w:w="4302" w:type="dxa"/>
             <w:tcBorders>
               <w:top w:val="single" w:sz="4" w:space="0" w:color="000000"/>
               <w:left w:val="single" w:sz="4" w:space="0" w:color="000000"/>
@@ -4299,7 +4629,7 @@
         <w:trPr/>
         <w:tc>
           <w:tcPr>
-            <w:tcW w:w="1399" w:type="dxa"/>
+            <w:tcW w:w="1398" w:type="dxa"/>
             <w:tcBorders>
               <w:top w:val="single" w:sz="4" w:space="0" w:color="000000"/>
               <w:left w:val="single" w:sz="4" w:space="0" w:color="000000"/>
@@ -4325,7 +4655,7 @@
         </w:tc>
         <w:tc>
           <w:tcPr>
-            <w:tcW w:w="4301" w:type="dxa"/>
+            <w:tcW w:w="4302" w:type="dxa"/>
             <w:tcBorders>
               <w:top w:val="single" w:sz="4" w:space="0" w:color="000000"/>
               <w:left w:val="single" w:sz="4" w:space="0" w:color="000000"/>
@@ -4380,7 +4710,7 @@
         <w:trPr/>
         <w:tc>
           <w:tcPr>
-            <w:tcW w:w="1399" w:type="dxa"/>
+            <w:tcW w:w="1398" w:type="dxa"/>
             <w:tcBorders>
               <w:top w:val="single" w:sz="4" w:space="0" w:color="000000"/>
               <w:left w:val="single" w:sz="4" w:space="0" w:color="000000"/>
@@ -4407,7 +4737,7 @@
         </w:tc>
         <w:tc>
           <w:tcPr>
-            <w:tcW w:w="4301" w:type="dxa"/>
+            <w:tcW w:w="4302" w:type="dxa"/>
             <w:tcBorders>
               <w:top w:val="single" w:sz="4" w:space="0" w:color="000000"/>
               <w:left w:val="single" w:sz="4" w:space="0" w:color="000000"/>
@@ -4473,7 +4803,11 @@
         </w:rPr>
       </w:pPr>
       <w:r>
-        <w:rPr/>
+        <w:rPr>
+          <w:i/>
+          <w:iCs/>
+          <w:color w:val="595959"/>
+        </w:rPr>
       </w:r>
     </w:p>
     <w:sectPr>
@@ -4631,6 +4965,143 @@
   <w:abstractNum w:abstractNumId="2">
     <w:lvl w:ilvl="0">
       <w:start w:val="1"/>
+      <w:numFmt w:val="bullet"/>
+      <w:lvlText w:val=""/>
+      <w:lvlJc w:val="left"/>
+      <w:pPr>
+        <w:tabs>
+          <w:tab w:val="num" w:pos="0"/>
+        </w:tabs>
+        <w:ind w:left="720" w:hanging="360"/>
+      </w:pPr>
+      <w:rPr>
+        <w:rFonts w:ascii="Wingdings" w:hAnsi="Wingdings" w:cs="Wingdings" w:hint="default"/>
+      </w:rPr>
+    </w:lvl>
+    <w:lvl w:ilvl="1">
+      <w:start w:val="1"/>
+      <w:numFmt w:val="bullet"/>
+      <w:lvlText w:val=""/>
+      <w:lvlJc w:val="left"/>
+      <w:pPr>
+        <w:tabs>
+          <w:tab w:val="num" w:pos="0"/>
+        </w:tabs>
+        <w:ind w:left="1440" w:hanging="360"/>
+      </w:pPr>
+      <w:rPr>
+        <w:rFonts w:ascii="Wingdings 2" w:hAnsi="Wingdings 2" w:cs="Wingdings 2" w:hint="default"/>
+      </w:rPr>
+    </w:lvl>
+    <w:lvl w:ilvl="2">
+      <w:start w:val="1"/>
+      <w:numFmt w:val="bullet"/>
+      <w:lvlText w:val="■"/>
+      <w:lvlJc w:val="left"/>
+      <w:pPr>
+        <w:tabs>
+          <w:tab w:val="num" w:pos="0"/>
+        </w:tabs>
+        <w:ind w:left="2160" w:hanging="360"/>
+      </w:pPr>
+      <w:rPr>
+        <w:rFonts w:ascii="OpenSymbol" w:hAnsi="OpenSymbol" w:cs="OpenSymbol" w:hint="default"/>
+      </w:rPr>
+    </w:lvl>
+    <w:lvl w:ilvl="3">
+      <w:start w:val="1"/>
+      <w:numFmt w:val="bullet"/>
+      <w:lvlText w:val=""/>
+      <w:lvlJc w:val="left"/>
+      <w:pPr>
+        <w:tabs>
+          <w:tab w:val="num" w:pos="0"/>
+        </w:tabs>
+        <w:ind w:left="2880" w:hanging="360"/>
+      </w:pPr>
+      <w:rPr>
+        <w:rFonts w:ascii="Wingdings" w:hAnsi="Wingdings" w:cs="Wingdings" w:hint="default"/>
+      </w:rPr>
+    </w:lvl>
+    <w:lvl w:ilvl="4">
+      <w:start w:val="1"/>
+      <w:numFmt w:val="bullet"/>
+      <w:lvlText w:val=""/>
+      <w:lvlJc w:val="left"/>
+      <w:pPr>
+        <w:tabs>
+          <w:tab w:val="num" w:pos="0"/>
+        </w:tabs>
+        <w:ind w:left="3600" w:hanging="360"/>
+      </w:pPr>
+      <w:rPr>
+        <w:rFonts w:ascii="Wingdings 2" w:hAnsi="Wingdings 2" w:cs="Wingdings 2" w:hint="default"/>
+      </w:rPr>
+    </w:lvl>
+    <w:lvl w:ilvl="5">
+      <w:start w:val="1"/>
+      <w:numFmt w:val="bullet"/>
+      <w:lvlText w:val="■"/>
+      <w:lvlJc w:val="left"/>
+      <w:pPr>
+        <w:tabs>
+          <w:tab w:val="num" w:pos="0"/>
+        </w:tabs>
+        <w:ind w:left="4320" w:hanging="360"/>
+      </w:pPr>
+      <w:rPr>
+        <w:rFonts w:ascii="OpenSymbol" w:hAnsi="OpenSymbol" w:cs="OpenSymbol" w:hint="default"/>
+      </w:rPr>
+    </w:lvl>
+    <w:lvl w:ilvl="6">
+      <w:start w:val="1"/>
+      <w:numFmt w:val="bullet"/>
+      <w:lvlText w:val=""/>
+      <w:lvlJc w:val="left"/>
+      <w:pPr>
+        <w:tabs>
+          <w:tab w:val="num" w:pos="0"/>
+        </w:tabs>
+        <w:ind w:left="5040" w:hanging="360"/>
+      </w:pPr>
+      <w:rPr>
+        <w:rFonts w:ascii="Wingdings" w:hAnsi="Wingdings" w:cs="Wingdings" w:hint="default"/>
+      </w:rPr>
+    </w:lvl>
+    <w:lvl w:ilvl="7">
+      <w:start w:val="1"/>
+      <w:numFmt w:val="bullet"/>
+      <w:lvlText w:val=""/>
+      <w:lvlJc w:val="left"/>
+      <w:pPr>
+        <w:tabs>
+          <w:tab w:val="num" w:pos="0"/>
+        </w:tabs>
+        <w:ind w:left="5760" w:hanging="360"/>
+      </w:pPr>
+      <w:rPr>
+        <w:rFonts w:ascii="Wingdings" w:hAnsi="Wingdings" w:cs="Wingdings" w:hint="default"/>
+      </w:rPr>
+    </w:lvl>
+    <w:lvl w:ilvl="8">
+      <w:start w:val="1"/>
+      <w:numFmt w:val="bullet"/>
+      <w:lvlText w:val=""/>
+      <w:lvlJc w:val="left"/>
+      <w:pPr>
+        <w:tabs>
+          <w:tab w:val="num" w:pos="0"/>
+        </w:tabs>
+        <w:ind w:left="6480" w:hanging="360"/>
+      </w:pPr>
+      <w:rPr>
+        <w:rFonts w:ascii="Wingdings" w:hAnsi="Wingdings" w:cs="Wingdings" w:hint="default"/>
+      </w:rPr>
+    </w:lvl>
+  </w:abstractNum>
+  <w:abstractNum w:abstractNumId="3">
+    <w:lvl w:ilvl="0">
+      <w:start w:val="1"/>
       <w:numFmt w:val="none"/>
       <w:suff w:val="nothing"/>
       <w:lvlText w:val=""/>
@@ -4754,10 +5225,112 @@
     <w:abstractNumId w:val="2"/>
   </w:num>
   <w:num w:numId="3">
-    <w:abstractNumId w:val="1"/>
+    <w:abstractNumId w:val="3"/>
+  </w:num>
+  <w:num w:numId="4">
+    <w:abstractNumId w:val="2"/>
     <w:lvlOverride w:ilvl="0">
       <w:startOverride w:val="1"/>
     </w:lvlOverride>
+  </w:num>
+  <w:num w:numId="5">
+    <w:abstractNumId w:val="2"/>
+  </w:num>
+  <w:num w:numId="6">
+    <w:abstractNumId w:val="2"/>
+  </w:num>
+  <w:num w:numId="7">
+    <w:abstractNumId w:val="2"/>
+  </w:num>
+  <w:num w:numId="8">
+    <w:abstractNumId w:val="2"/>
+  </w:num>
+  <w:num w:numId="9">
+    <w:abstractNumId w:val="2"/>
+  </w:num>
+  <w:num w:numId="10">
+    <w:abstractNumId w:val="2"/>
+  </w:num>
+  <w:num w:numId="11">
+    <w:abstractNumId w:val="2"/>
+  </w:num>
+  <w:num w:numId="12">
+    <w:abstractNumId w:val="2"/>
+  </w:num>
+  <w:num w:numId="13">
+    <w:abstractNumId w:val="2"/>
+  </w:num>
+  <w:num w:numId="14">
+    <w:abstractNumId w:val="2"/>
+  </w:num>
+  <w:num w:numId="15">
+    <w:abstractNumId w:val="2"/>
+  </w:num>
+  <w:num w:numId="16">
+    <w:abstractNumId w:val="2"/>
+  </w:num>
+  <w:num w:numId="17">
+    <w:abstractNumId w:val="2"/>
+  </w:num>
+  <w:num w:numId="18">
+    <w:abstractNumId w:val="2"/>
+  </w:num>
+  <w:num w:numId="19">
+    <w:abstractNumId w:val="2"/>
+  </w:num>
+  <w:num w:numId="20">
+    <w:abstractNumId w:val="2"/>
+  </w:num>
+  <w:num w:numId="21">
+    <w:abstractNumId w:val="2"/>
+  </w:num>
+  <w:num w:numId="22">
+    <w:abstractNumId w:val="2"/>
+  </w:num>
+  <w:num w:numId="23">
+    <w:abstractNumId w:val="2"/>
+  </w:num>
+  <w:num w:numId="24">
+    <w:abstractNumId w:val="2"/>
+  </w:num>
+  <w:num w:numId="25">
+    <w:abstractNumId w:val="2"/>
+  </w:num>
+  <w:num w:numId="26">
+    <w:abstractNumId w:val="2"/>
+  </w:num>
+  <w:num w:numId="27">
+    <w:abstractNumId w:val="2"/>
+  </w:num>
+  <w:num w:numId="28">
+    <w:abstractNumId w:val="2"/>
+  </w:num>
+  <w:num w:numId="29">
+    <w:abstractNumId w:val="2"/>
+  </w:num>
+  <w:num w:numId="30">
+    <w:abstractNumId w:val="2"/>
+  </w:num>
+  <w:num w:numId="31">
+    <w:abstractNumId w:val="2"/>
+  </w:num>
+  <w:num w:numId="32">
+    <w:abstractNumId w:val="2"/>
+  </w:num>
+  <w:num w:numId="33">
+    <w:abstractNumId w:val="2"/>
+  </w:num>
+  <w:num w:numId="34">
+    <w:abstractNumId w:val="2"/>
+  </w:num>
+  <w:num w:numId="35">
+    <w:abstractNumId w:val="2"/>
+  </w:num>
+  <w:num w:numId="36">
+    <w:abstractNumId w:val="2"/>
+  </w:num>
+  <w:num w:numId="37">
+    <w:abstractNumId w:val="2"/>
   </w:num>
 </w:numbering>
 </file>
@@ -4782,6 +5355,7 @@
     <w:qFormat/>
     <w:pPr>
       <w:widowControl/>
+      <w:suppressAutoHyphens w:val="true"/>
       <w:bidi w:val="0"/>
       <w:spacing w:before="0" w:after="0"/>
       <w:jc w:val="left"/>
@@ -4993,6 +5567,7 @@
     <w:qFormat/>
     <w:pPr>
       <w:widowControl/>
+      <w:suppressAutoHyphens w:val="true"/>
       <w:bidi w:val="0"/>
       <w:spacing w:before="0" w:after="0"/>
       <w:jc w:val="left"/>
@@ -5013,6 +5588,7 @@
     <w:qFormat/>
     <w:pPr>
       <w:widowControl/>
+      <w:suppressAutoHyphens w:val="true"/>
       <w:bidi w:val="0"/>
       <w:spacing w:before="0" w:after="0"/>
       <w:jc w:val="left"/>

</xml_diff>